<commit_message>
docs: standard footer — authorship + Creative Commons BY-NC notice (all 8)
Footer on every page now reads:
  Dr. Payungsak Kaenchan | Faculty of Liberal Arts, Mahidol University
  Creative Commons BY-NC · Educational, non-commercial use only · No profit ·
  Reuse or duplication must credit the author and obtain prior consent.

Rebuilt all eight artifacts (.docx + PDF) with the updated fp_docgen footer.

Co-Authored-By: Claude Opus 4.7 (1M context) <noreply@anthropic.com>
</commit_message>
<xml_diff>
--- a/docs/document-scrutiny/SCRUTINY-REPORT.docx
+++ b/docs/document-scrutiny/SCRUTINY-REPORT.docx
@@ -11076,7 +11076,8 @@
   <w:p>
     <w:pPr>
       <w:pStyle w:val="Footer"/>
-      <w:jc w:val="left"/>
+      <w:spacing w:after="20"/>
+      <w:jc w:val="center"/>
     </w:pPr>
     <w:r>
       <w:rPr>
@@ -11085,20 +11086,25 @@
         <w:i w:val="0"/>
         <w:color w:val="5A5A60"/>
         <w:sz w:val="15"/>
-        <w:spacing w:val="12"/>
-      </w:rPr>
-      <w:t xml:space="preserve">Dr. Payungsak Kaenchan · Faculty of Liberal Arts   ·   </w:t>
+        <w:spacing w:val="10"/>
+      </w:rPr>
+      <w:t>Dr. Payungsak Kaenchan  |  Faculty of Liberal Arts, Mahidol University</w:t>
     </w:r>
+  </w:p>
+  <w:p>
+    <w:pPr>
+      <w:jc w:val="center"/>
+    </w:pPr>
     <w:r>
       <w:rPr>
         <w:rFonts w:ascii="Menlo" w:hAnsi="Menlo" w:cs="Menlo"/>
         <w:b w:val="0"/>
         <w:i w:val="0"/>
         <w:color w:val="5A5A60"/>
-        <w:sz w:val="15"/>
-        <w:spacing w:val="12"/>
-      </w:rPr>
-      <w:t>FUTUREPROOF · SPU Tech Creative Learning Awards 2569</w:t>
+        <w:sz w:val="13"/>
+        <w:spacing w:val="6"/>
+      </w:rPr>
+      <w:t>Creative Commons BY-NC · Educational, non-commercial use only · No profit · Reuse or duplication must credit the author and obtain prior consent.</w:t>
     </w:r>
   </w:p>
 </w:ftr>

</xml_diff>

<commit_message>
docs: add official Creative Commons BY-NC badge to every footer
Embed the official CC BY-NC 4.0 license button (assets/licenses/) centred in
the footer above the authorship + reuse notice, on every page of all 8 docs.
Rebuilt the full set (.docx + PDF).

Co-Authored-By: Claude Opus 4.7 (1M context) <noreply@anthropic.com>
</commit_message>
<xml_diff>
--- a/docs/document-scrutiny/SCRUTINY-REPORT.docx
+++ b/docs/document-scrutiny/SCRUTINY-REPORT.docx
@@ -4,20 +4,42 @@
   <w:body>
     <w:p>
       <w:pPr>
-        <w:spacing w:before="800" w:after="800"/>
+        <w:spacing w:after="360"/>
         <w:jc w:val="center"/>
-        <w:shd w:val="clear" w:color="auto" w:fill="F3ECDD"/>
       </w:pPr>
       <w:r>
-        <w:rPr>
-          <w:rFonts w:ascii="Menlo" w:hAnsi="Menlo" w:cs="Menlo"/>
-          <w:b w:val="0"/>
-          <w:i w:val="0"/>
-          <w:color w:val="9C6F1C"/>
-          <w:sz w:val="18"/>
-          <w:spacing w:val="8"/>
-        </w:rPr>
-        <w:t>[ COVER IMAGE — drop scrutiny-report.png in /docs/document-design/covers/ ]</w:t>
+        <w:drawing>
+          <wp:inline xmlns:a="http://schemas.openxmlformats.org/drawingml/2006/main" xmlns:pic="http://schemas.openxmlformats.org/drawingml/2006/picture">
+            <wp:extent cx="5976000" cy="3984000"/>
+            <wp:docPr id="1" name="Picture 1"/>
+            <wp:cNvGraphicFramePr>
+              <a:graphicFrameLocks noChangeAspect="1"/>
+            </wp:cNvGraphicFramePr>
+            <a:graphic>
+              <a:graphicData uri="http://schemas.openxmlformats.org/drawingml/2006/picture">
+                <pic:pic>
+                  <pic:nvPicPr>
+                    <pic:cNvPr id="0" name="scrutiny-report.png"/>
+                    <pic:cNvPicPr/>
+                  </pic:nvPicPr>
+                  <pic:blipFill>
+                    <a:blip r:embed="rId9"/>
+                    <a:stretch>
+                      <a:fillRect/>
+                    </a:stretch>
+                  </pic:blipFill>
+                  <pic:spPr>
+                    <a:xfrm>
+                      <a:off x="0" y="0"/>
+                      <a:ext cx="5976000" cy="3984000"/>
+                    </a:xfrm>
+                    <a:prstGeom prst="rect"/>
+                  </pic:spPr>
+                </pic:pic>
+              </a:graphicData>
+            </a:graphic>
+          </wp:inline>
+        </w:drawing>
       </w:r>
     </w:p>
     <w:p>
@@ -11061,7 +11083,7 @@
       </w:r>
     </w:p>
     <w:sectPr>
-      <w:footerReference w:type="default" r:id="rId9"/>
+      <w:footerReference w:type="default" r:id="rId10"/>
       <w:pgSz w:w="11906" w:h="16838"/>
       <w:pgMar w:top="1247" w:right="1247" w:bottom="1134" w:left="1247" w:header="720" w:footer="720" w:gutter="0"/>
       <w:cols w:space="720"/>
@@ -11076,6 +11098,46 @@
   <w:p>
     <w:pPr>
       <w:pStyle w:val="Footer"/>
+      <w:spacing w:after="40"/>
+      <w:jc w:val="center"/>
+    </w:pPr>
+    <w:r>
+      <w:drawing>
+        <wp:inline xmlns:a="http://schemas.openxmlformats.org/drawingml/2006/main" xmlns:pic="http://schemas.openxmlformats.org/drawingml/2006/picture">
+          <wp:extent cx="684000" cy="240955"/>
+          <wp:docPr id="1" name="Picture 1"/>
+          <wp:cNvGraphicFramePr>
+            <a:graphicFrameLocks noChangeAspect="1"/>
+          </wp:cNvGraphicFramePr>
+          <a:graphic>
+            <a:graphicData uri="http://schemas.openxmlformats.org/drawingml/2006/picture">
+              <pic:pic>
+                <pic:nvPicPr>
+                  <pic:cNvPr id="0" name="cc-by-nc-88x31.png"/>
+                  <pic:cNvPicPr/>
+                </pic:nvPicPr>
+                <pic:blipFill>
+                  <a:blip r:embed="rId1"/>
+                  <a:stretch>
+                    <a:fillRect/>
+                  </a:stretch>
+                </pic:blipFill>
+                <pic:spPr>
+                  <a:xfrm>
+                    <a:off x="0" y="0"/>
+                    <a:ext cx="684000" cy="240955"/>
+                  </a:xfrm>
+                  <a:prstGeom prst="rect"/>
+                </pic:spPr>
+              </pic:pic>
+            </a:graphicData>
+          </a:graphic>
+        </wp:inline>
+      </w:drawing>
+    </w:r>
+  </w:p>
+  <w:p>
+    <w:pPr>
       <w:spacing w:after="20"/>
       <w:jc w:val="center"/>
     </w:pPr>

</xml_diff>